<commit_message>
Remove color and shading from Design.docx
Made-with: Cursor
</commit_message>
<xml_diff>
--- a/Design.docx
+++ b/Design.docx
@@ -8,6 +8,9 @@
         <w:jc w:val="center"/>
       </w:pPr>
       <w:r>
+        <w:rPr>
+          <w:color w:val="000000"/>
+        </w:rPr>
         <w:t>HW3 Design Document</w:t>
       </w:r>
     </w:p>
@@ -85,7 +88,7 @@
     </w:p>
     <w:tbl>
       <w:tblPr>
-        <w:tblStyle w:val="LightGrid-Accent1"/>
+        <w:tblStyle w:val="TableGrid"/>
         <w:tblW w:type="auto" w:w="0"/>
         <w:jc w:val="center"/>
         <w:tblLook w:firstColumn="1" w:firstRow="1" w:lastColumn="0" w:lastRow="0" w:noHBand="0" w:noVBand="1" w:val="04A0"/>
@@ -292,7 +295,7 @@
     </w:p>
     <w:tbl>
       <w:tblPr>
-        <w:tblStyle w:val="LightGrid-Accent1"/>
+        <w:tblStyle w:val="TableGrid"/>
         <w:tblW w:type="auto" w:w="0"/>
         <w:jc w:val="center"/>
         <w:tblLook w:firstColumn="1" w:firstRow="1" w:lastColumn="0" w:lastRow="0" w:noHBand="0" w:noVBand="1" w:val="04A0"/>
@@ -483,7 +486,7 @@
     </w:p>
     <w:tbl>
       <w:tblPr>
-        <w:tblStyle w:val="LightGrid-Accent1"/>
+        <w:tblStyle w:val="TableGrid"/>
         <w:tblW w:type="auto" w:w="0"/>
         <w:jc w:val="center"/>
         <w:tblLook w:firstColumn="1" w:firstRow="1" w:lastColumn="0" w:lastRow="0" w:noHBand="0" w:noVBand="1" w:val="04A0"/>
@@ -767,7 +770,7 @@
     </w:p>
     <w:tbl>
       <w:tblPr>
-        <w:tblStyle w:val="LightGrid-Accent1"/>
+        <w:tblStyle w:val="TableGrid"/>
         <w:tblW w:type="auto" w:w="0"/>
         <w:jc w:val="center"/>
         <w:tblLook w:firstColumn="1" w:firstRow="1" w:lastColumn="0" w:lastRow="0" w:noHBand="0" w:noVBand="1" w:val="04A0"/>
@@ -1429,7 +1432,7 @@
       <w:rFonts w:asciiTheme="majorHAnsi" w:eastAsiaTheme="majorEastAsia" w:hAnsiTheme="majorHAnsi" w:cstheme="majorBidi"/>
       <w:b/>
       <w:bCs/>
-      <w:color w:val="365F91" w:themeColor="accent1" w:themeShade="BF"/>
+      <w:color w:val="000000"/>
       <w:sz w:val="28"/>
       <w:szCs w:val="28"/>
     </w:rPr>
@@ -1453,7 +1456,7 @@
       <w:rFonts w:asciiTheme="majorHAnsi" w:eastAsiaTheme="majorEastAsia" w:hAnsiTheme="majorHAnsi" w:cstheme="majorBidi"/>
       <w:b/>
       <w:bCs/>
-      <w:color w:val="4F81BD" w:themeColor="accent1"/>
+      <w:color w:val="000000"/>
       <w:sz w:val="26"/>
       <w:szCs w:val="26"/>
     </w:rPr>
@@ -1477,7 +1480,7 @@
       <w:rFonts w:asciiTheme="majorHAnsi" w:eastAsiaTheme="majorEastAsia" w:hAnsiTheme="majorHAnsi" w:cstheme="majorBidi"/>
       <w:b/>
       <w:bCs/>
-      <w:color w:val="4F81BD" w:themeColor="accent1"/>
+      <w:color w:val="000000"/>
     </w:rPr>
   </w:style>
   <w:style w:type="paragraph" w:styleId="Heading4">
@@ -1502,7 +1505,7 @@
       <w:bCs/>
       <w:i/>
       <w:iCs/>
-      <w:color w:val="4F81BD" w:themeColor="accent1"/>
+      <w:color w:val="000000"/>
     </w:rPr>
   </w:style>
   <w:style w:type="paragraph" w:styleId="Heading5">
@@ -1716,7 +1719,7 @@
     </w:pPr>
     <w:rPr>
       <w:rFonts w:asciiTheme="majorHAnsi" w:eastAsiaTheme="majorEastAsia" w:hAnsiTheme="majorHAnsi" w:cstheme="majorBidi"/>
-      <w:color w:val="17365D" w:themeColor="text2" w:themeShade="BF"/>
+      <w:color w:val="000000"/>
       <w:spacing w:val="5"/>
       <w:kern w:val="28"/>
       <w:sz w:val="52"/>

</xml_diff>